<commit_message>
Add AI-assistance disclaimer across all pages and documents
Consistent disclaimer referencing MIA on all three HTML dashboards
(comprehensive-briefing, index, workforce-dynamics) and within all
linked documents (comprehensive Word report, TOCA analysis report,
workforce dynamics report, PowerPoint briefing). Covers AI assistance,
not-investment-advice, public-data-only, and source verification.

Co-Authored-By: Claude Opus 4.6 <noreply@anthropic.com>
</commit_message>
<xml_diff>
--- a/docs/BMO_Comprehensive_Workforce_Briefing.docx
+++ b/docs/BMO_Comprehensive_Workforce_Briefing.docx
@@ -8726,6 +8726,46 @@
       </w:pPr>
       <w:r>
         <w:t xml:space="preserve">Bank of Canada Working Paper 2025-1: International Exposure of Canadian Banks</w:t>
+      </w:r>
+    </w:p>
+    <w:p>
+      <w:pPr>
+        <w:spacing w:before="400"/>
+      </w:pPr>
+    </w:p>
+    <w:p>
+      <w:pPr>
+        <w:pBdr>
+          <w:top w:val="single" w:color="CCCCCC" w:sz="1" w:space="8"/>
+        </w:pBdr>
+        <w:spacing w:after="100" w:before="200"/>
+      </w:pPr>
+      <w:r>
+        <w:rPr>
+          <w:rFonts w:ascii="Arial" w:cs="Arial" w:eastAsia="Arial" w:hAnsi="Arial"/>
+          <w:b/>
+          <w:bCs/>
+          <w:color w:val="666666"/>
+          <w:sz w:val="18"/>
+          <w:szCs w:val="18"/>
+        </w:rPr>
+        <w:t xml:space="preserve">Disclaimer</w:t>
+      </w:r>
+    </w:p>
+    <w:p>
+      <w:pPr>
+        <w:spacing w:after="100"/>
+      </w:pPr>
+      <w:r>
+        <w:rPr>
+          <w:rFonts w:ascii="Arial" w:cs="Arial" w:eastAsia="Arial" w:hAnsi="Arial"/>
+          <w:i/>
+          <w:iCs/>
+          <w:color w:val="888888"/>
+          <w:sz w:val="18"/>
+          <w:szCs w:val="18"/>
+        </w:rPr>
+        <w:t xml:space="preserve">This document was produced with the assistance of MIA, an AI-powered research tool. It does not constitute investment, financial, or professional advice. All analysis is based entirely on publicly available information — no internal BMO data was used. Original sources and methodology have been provided so that readers may independently verify the findings. Estimates are approximations and carry ±3–5% uncertainty.</w:t>
       </w:r>
     </w:p>
     <w:sectPr>

</xml_diff>